<commit_message>
Buang penilaian kebarangkalian JPA daripada deck, Proposal v2.3 dan Analisis Isu v1.6
</commit_message>
<xml_diff>
--- a/files/Analisis_Isu_4Negeri_Besar_KEMAS_v1.6.docx
+++ b/files/Analisis_Isu_4Negeri_Besar_KEMAS_v1.6.docx
@@ -2248,7 +2248,7 @@
                 <w:sz w:val="20"/>
                 <w:szCs w:val="20"/>
               </w:rPr>
-              <w:t xml:space="preserve">Jadual K.1 membandingkan kedua-dua senario merentas skop, kos, prasyarat data, tempoh, risiko dan kebarangkalian kelulusan; kandungan disandarkan sepenuhnya kepada Bahagian 7.2, 8.3 hingga 8.5, 11.5, 11.6 dan Lampiran G, H, I Kertas Cadangan Model Negeri Besar Versi 2.2 yang sedia disahkan.</w:t>
+              <w:t xml:space="preserve">Jadual K.1 membandingkan kedua-dua senario merentas skop, kos, prasyarat data, tempoh dan risiko; kandungan disandarkan sepenuhnya kepada Bahagian 7.2, 8.3 hingga 8.5, 11.5, 11.6 dan Lampiran G, H, I Kertas Cadangan Model Negeri Besar Versi 2.2 yang sedia disahkan.</w:t>
             </w:r>
           </w:p>
         </w:tc>
@@ -18026,7 +18026,7 @@
           <w:sz w:val="20"/>
           <w:szCs w:val="20"/>
         </w:rPr>
-        <w:t xml:space="preserve">Susulan tuntutan naik taraf gred Pegawai KEMAS Bahagian/Daerah (PKB/PKD) yang berulang dalam Isu 8 (naik taraf, khususnya Perak dan Sabah) dan Isu 9 (liputan geografi tidak seimbang, Sarawak dan Johor), bahagian ini membentangkan dua senario dasar yang boleh dibawa kepada JPA, disertakan skop, kos, prasyarat data, risiko dan kebarangkalian kelulusan setiap satu. Kedua-dua senario dibentangkan secara neutral untuk pertimbangan pengurusan; kertas ini tidak memutuskan bagi pihak JPA.</w:t>
+        <w:t xml:space="preserve">Susulan tuntutan naik taraf gred Pegawai KEMAS Bahagian/Daerah (PKB/PKD) yang berulang dalam Isu 8 (naik taraf, khususnya Perak dan Sabah) dan Isu 9 (liputan geografi tidak seimbang, Sarawak dan Johor), bahagian ini membentangkan dua senario dasar yang boleh dibawa kepada JPA, disertakan skop, kos, prasyarat data, risiko dan tempoh setiap satu. Kedua-dua senario dibentangkan secara neutral untuk pertimbangan pengurusan; kertas ini tidak memutuskan bagi pihak JPA.</w:t>
       </w:r>
     </w:p>
     <w:p>
@@ -18261,7 +18261,7 @@
           <w:sz w:val="20"/>
           <w:szCs w:val="20"/>
         </w:rPr>
-        <w:t xml:space="preserve">Tempoh dan kebarangkalian. </w:t>
+        <w:t xml:space="preserve">Tempoh. </w:t>
       </w:r>
       <w:r>
         <w:rPr>
@@ -18270,27 +18270,7 @@
           <w:sz w:val="20"/>
           <w:szCs w:val="20"/>
         </w:rPr>
-        <w:t xml:space="preserve">Panjang (melebihi 12 bulan, tertakluk kelulusan JPA). Kebarangkalian kelulusan pada peringkat semasa dinilai </w:t>
-      </w:r>
-      <w:r>
-        <w:rPr>
-          <w:rFonts w:ascii="Cambria" w:cs="Cambria" w:eastAsia="Cambria" w:hAnsi="Cambria"/>
-          <w:b/>
-          <w:bCs/>
-          <w:color w:val="C00000"/>
-          <w:sz w:val="20"/>
-          <w:szCs w:val="20"/>
-        </w:rPr>
-        <w:t xml:space="preserve">RENDAH</w:t>
-      </w:r>
-      <w:r>
-        <w:rPr>
-          <w:rFonts w:ascii="Cambria" w:cs="Cambria" w:eastAsia="Cambria" w:hAnsi="Cambria"/>
-          <w:color w:val="1F2937"/>
-          <w:sz w:val="20"/>
-          <w:szCs w:val="20"/>
-        </w:rPr>
-        <w:t xml:space="preserve">, disebabkan jurang JD dan data di 3 daripada 4 negeri.</w:t>
+        <w:t xml:space="preserve">Panjang (melebihi 12 bulan, tertakluk kelulusan JPA).</w:t>
       </w:r>
     </w:p>
     <w:p>
@@ -18454,7 +18434,7 @@
           <w:sz w:val="20"/>
           <w:szCs w:val="20"/>
         </w:rPr>
-        <w:t xml:space="preserve">Tempoh dan kebarangkalian. </w:t>
+        <w:t xml:space="preserve">Tempoh. </w:t>
       </w:r>
       <w:r>
         <w:rPr>
@@ -18463,27 +18443,7 @@
           <w:sz w:val="20"/>
           <w:szCs w:val="20"/>
         </w:rPr>
-        <w:t xml:space="preserve">Serta-merta bagi permohonan penyertaan; hasil sederhana hingga panjang bergantung kitaran JPA. Kebarangkalian diterima dinilai </w:t>
-      </w:r>
-      <w:r>
-        <w:rPr>
-          <w:rFonts w:ascii="Cambria" w:cs="Cambria" w:eastAsia="Cambria" w:hAnsi="Cambria"/>
-          <w:b/>
-          <w:bCs/>
-          <w:color w:val="548235"/>
-          <w:sz w:val="20"/>
-          <w:szCs w:val="20"/>
-        </w:rPr>
-        <w:t xml:space="preserve">TINGGI</w:t>
-      </w:r>
-      <w:r>
-        <w:rPr>
-          <w:rFonts w:ascii="Cambria" w:cs="Cambria" w:eastAsia="Cambria" w:hAnsi="Cambria"/>
-          <w:color w:val="1F2937"/>
-          <w:sz w:val="20"/>
-          <w:szCs w:val="20"/>
-        </w:rPr>
-        <w:t xml:space="preserve">, kerana tiada implikasi kos atau struktur segera yang perlu dipertahankan hari ini.</w:t>
+        <w:t xml:space="preserve">Serta-merta bagi permohonan penyertaan; hasil sederhana hingga panjang bergantung kitaran JPA.</w:t>
       </w:r>
     </w:p>
     <w:p>
@@ -19221,7 +19181,7 @@
                 <w:sz w:val="17"/>
                 <w:szCs w:val="17"/>
               </w:rPr>
-              <w:t xml:space="preserve">Kebarangkalian JPA bersetuju</w:t>
+              <w:t xml:space="preserve">Kesan strategik</w:t>
             </w:r>
           </w:p>
         </w:tc>
@@ -19235,119 +19195,6 @@
               <w:right w:val="single" w:color="C9CFD8" w:sz="4"/>
             </w:tcBorders>
             <w:shd w:fill="F1EAF8" w:color="auto" w:val="clear"/>
-            <w:tcMar>
-              <w:top w:type="dxa" w:w="90"/>
-              <w:left w:type="dxa" w:w="120"/>
-              <w:bottom w:type="dxa" w:w="90"/>
-              <w:right w:type="dxa" w:w="120"/>
-            </w:tcMar>
-            <w:vAlign w:val="center"/>
-          </w:tcPr>
-          <w:p>
-            <w:pPr>
-              <w:spacing w:line="254"/>
-              <w:jc w:val="left"/>
-            </w:pPr>
-            <w:r>
-              <w:rPr>
-                <w:rFonts w:ascii="Cambria" w:cs="Cambria" w:eastAsia="Cambria" w:hAnsi="Cambria"/>
-                <w:b/>
-                <w:bCs/>
-                <w:color w:val="C00000"/>
-                <w:sz w:val="17"/>
-                <w:szCs w:val="17"/>
-              </w:rPr>
-              <w:t xml:space="preserve">Rendah</w:t>
-            </w:r>
-          </w:p>
-        </w:tc>
-        <w:tc>
-          <w:tcPr>
-            <w:tcW w:type="dxa" w:w="3663"/>
-            <w:tcBorders>
-              <w:top w:val="single" w:color="C9CFD8" w:sz="4"/>
-              <w:left w:val="single" w:color="C9CFD8" w:sz="4"/>
-              <w:bottom w:val="single" w:color="C9CFD8" w:sz="4"/>
-              <w:right w:val="single" w:color="C9CFD8" w:sz="4"/>
-            </w:tcBorders>
-            <w:shd w:fill="F1EAF8" w:color="auto" w:val="clear"/>
-            <w:tcMar>
-              <w:top w:type="dxa" w:w="90"/>
-              <w:left w:type="dxa" w:w="120"/>
-              <w:bottom w:type="dxa" w:w="90"/>
-              <w:right w:type="dxa" w:w="120"/>
-            </w:tcMar>
-            <w:vAlign w:val="center"/>
-          </w:tcPr>
-          <w:p>
-            <w:pPr>
-              <w:spacing w:line="254"/>
-              <w:jc w:val="left"/>
-            </w:pPr>
-            <w:r>
-              <w:rPr>
-                <w:rFonts w:ascii="Cambria" w:cs="Cambria" w:eastAsia="Cambria" w:hAnsi="Cambria"/>
-                <w:b/>
-                <w:bCs/>
-                <w:color w:val="548235"/>
-                <w:sz w:val="17"/>
-                <w:szCs w:val="17"/>
-              </w:rPr>
-              <w:t xml:space="preserve">Tinggi</w:t>
-            </w:r>
-          </w:p>
-        </w:tc>
-      </w:tr>
-      <w:tr>
-        <w:trPr>
-          <w:cantSplit/>
-          <w:trHeight w:val="500" w:hRule="atLeast"/>
-        </w:trPr>
-        <w:tc>
-          <w:tcPr>
-            <w:tcW w:type="dxa" w:w="1700"/>
-            <w:tcBorders>
-              <w:top w:val="single" w:color="C9CFD8" w:sz="4"/>
-              <w:left w:val="single" w:color="C9CFD8" w:sz="4"/>
-              <w:bottom w:val="single" w:color="C9CFD8" w:sz="4"/>
-              <w:right w:val="single" w:color="C9CFD8" w:sz="4"/>
-            </w:tcBorders>
-            <w:shd w:fill="D9C9EC" w:color="auto" w:val="clear"/>
-            <w:tcMar>
-              <w:top w:type="dxa" w:w="90"/>
-              <w:left w:type="dxa" w:w="120"/>
-              <w:bottom w:type="dxa" w:w="90"/>
-              <w:right w:type="dxa" w:w="120"/>
-            </w:tcMar>
-            <w:vAlign w:val="center"/>
-          </w:tcPr>
-          <w:p>
-            <w:pPr>
-              <w:spacing w:line="254"/>
-              <w:jc w:val="center"/>
-            </w:pPr>
-            <w:r>
-              <w:rPr>
-                <w:rFonts w:ascii="Cambria" w:cs="Cambria" w:eastAsia="Cambria" w:hAnsi="Cambria"/>
-                <w:b/>
-                <w:bCs/>
-                <w:color w:val="7030A0"/>
-                <w:sz w:val="17"/>
-                <w:szCs w:val="17"/>
-              </w:rPr>
-              <w:t xml:space="preserve">Kesan strategik</w:t>
-            </w:r>
-          </w:p>
-        </w:tc>
-        <w:tc>
-          <w:tcPr>
-            <w:tcW w:type="dxa" w:w="3663"/>
-            <w:tcBorders>
-              <w:top w:val="single" w:color="C9CFD8" w:sz="4"/>
-              <w:left w:val="single" w:color="C9CFD8" w:sz="4"/>
-              <w:bottom w:val="single" w:color="C9CFD8" w:sz="4"/>
-              <w:right w:val="single" w:color="C9CFD8" w:sz="4"/>
-            </w:tcBorders>
             <w:tcMar>
               <w:top w:type="dxa" w:w="90"/>
               <w:left w:type="dxa" w:w="120"/>
@@ -19381,6 +19228,7 @@
               <w:bottom w:val="single" w:color="C9CFD8" w:sz="4"/>
               <w:right w:val="single" w:color="C9CFD8" w:sz="4"/>
             </w:tcBorders>
+            <w:shd w:fill="F1EAF8" w:color="auto" w:val="clear"/>
             <w:tcMar>
               <w:top w:type="dxa" w:w="90"/>
               <w:left w:type="dxa" w:w="120"/>

</xml_diff>

<commit_message>
Cadangan Kumpulan 4: perjuangkan Senario 1 (deck, Proposal v2.3, Analisis Isu v1.6)
</commit_message>
<xml_diff>
--- a/files/Analisis_Isu_4Negeri_Besar_KEMAS_v1.6.docx
+++ b/files/Analisis_Isu_4Negeri_Besar_KEMAS_v1.6.docx
@@ -19321,7 +19321,7 @@
                 <w:sz w:val="20"/>
                 <w:szCs w:val="20"/>
               </w:rPr>
-              <w:t xml:space="preserve">Bawa Senario 2 sebagai permohonan rasmi hari ini: risiko rendah, RM0 kos tambahan, selari kedudukan Pilihan 2 diikuti Pilihan 4 yang telah disyorkan Kertas Cadangan Model Negeri Besar.</w:t>
+              <w:t xml:space="preserve">Kumpulan 4 memperjuangkan Senario 1 sebagai permohonan rasmi sekarang: gred PKD di keempat-empat negeri diseragamkan kepada S9/S10 menyamai PKB. Tuntutan ini berulang merentas negeri (Isu 8 dan 9); beban tugas PKD yang disahkan melalui JD Perak setanding Penolong Pengarah Kanan; Sabah dan Johor telah menuntut S9/S10 secara bebas; struktur kerja Sarawak pula sedia meletakkan PKD pada Gred 9/10.</w:t>
             </w:r>
           </w:p>
           <w:p>
@@ -19336,7 +19336,7 @@
                 <w:sz w:val="20"/>
                 <w:szCs w:val="20"/>
               </w:rPr>
-              <w:t xml:space="preserve">Bentangkan Senario 1 sebagai hala tuju jangka panjang yang disokong bukti (Perak) tetapi memerlukan penyempurnaan data 3 negeri (JD Sarawak, JD Sabah, kemas kini notasi Johor) sebelum boleh dipertahankan sepenuhnya di hadapan JPA.</w:t>
+              <w:t xml:space="preserve">JD lengkap bagi kesemua 60 PKD dan penilaian jawatan (job evaluation) disiapkan serentak dengan permohonan, bukan sebagai syarat untuk menangguhkannya: JD 10 PKD Perak sudah lengkap, Sarawak dan Sabah menyediakan JD PKD masing-masing, manakala Johor mengemas kini JD templat sedia ada kepada notasi gred SSPA.</w:t>
             </w:r>
           </w:p>
           <w:p>
@@ -19351,7 +19351,7 @@
                 <w:sz w:val="20"/>
                 <w:szCs w:val="20"/>
               </w:rPr>
-              <w:t xml:space="preserve">Elak membentangkan Senario 1 sebagai permohonan segera tanpa penyempurnaan data ini: Lampiran I Kertas Cadangan Model Negeri Besar telah mengenal pasti risiko penolakan keseluruhan bagi permohonan berskala setara tanpa norma rasmi dan siri data lima tahun.</w:t>
+              <w:t xml:space="preserve">Kos sebenar dikira melalui kaedah pemindahan gred rasmi Bahagian Saraan JPA; julat RM2.16 juta hingga RM3.38 juta setahun kekal sebagai anggaran indikatif. Pilihan 2 diikuti Pilihan 4 yang disyorkan Kertas Cadangan Model Negeri Besar (RM0.757 juta setahun, termasuk naik taraf PKB Serian S5 ke S9) kekal diteruskan, manakala Senario 1 dibawa bersama sebagai permohonan khusus gred PKB/PKD.</w:t>
             </w:r>
           </w:p>
         </w:tc>

</xml_diff>